<commit_message>
create xfailing tests to fix outstanding bugs
</commit_message>
<xml_diff>
--- a/tests/fixtures/test_formatting_errors_en.docx
+++ b/tests/fixtures/test_formatting_errors_en.docx
@@ -207,12 +207,17 @@
     </w:tbl>
     <w:p/>
     <w:p>
+      <w:pPr>
+        <w:pStyle w:val="BodyText"/>
+      </w:pPr>
       <w:r>
         <w:t>This should be page 2.</w:t>
       </w:r>
     </w:p>
-    <w:p/>
     <w:p>
+      <w:pPr>
+        <w:pStyle w:val="BodyText"/>
+      </w:pPr>
       <w:r>
         <w:t>This footnote</w:t>
       </w:r>
@@ -244,8 +249,10 @@
         <w:t xml:space="preserve"> percentiles should not cause formatting errors either.</w:t>
       </w:r>
     </w:p>
-    <w:p/>
     <w:p>
+      <w:pPr>
+        <w:pStyle w:val="BodyText"/>
+      </w:pPr>
       <w:r>
         <w:t xml:space="preserve">This bracket mismatch error (because this is not italic) should just get a note that says “check formatting” because of the </w:t>
       </w:r>
@@ -275,6 +282,100 @@
         <w:t xml:space="preserve"> formatting. No need to reprint the entire full text again.</w:t>
       </w:r>
     </w:p>
+    <w:p>
+      <w:pPr>
+        <w:pStyle w:val="BodyText"/>
+      </w:pPr>
+      <w:r>
+        <w:t xml:space="preserve">The next paragraph should not create an error. </w:t>
+      </w:r>
+    </w:p>
+    <w:p>
+      <w:pPr>
+        <w:pStyle w:val="BodyText"/>
+      </w:pPr>
+      <w:r>
+        <w:t>Shrimp remains an important forage species, especially in the northern areas; its dominance in diets has decreased in recent years in the NL bioregion. The predation mortality index on shrimp remains at a high level in 2J3KL, but is much lower in 2H. The potential predator biomass index values for both the NSAR and SSAR have increased in recent years.</w:t>
+      </w:r>
+      <w:r>
+        <w:t xml:space="preserve"> </w:t>
+      </w:r>
+      <w:r>
+        <w:t>Predators include Greenland Halibut (</w:t>
+      </w:r>
+      <w:proofErr w:type="spellStart"/>
+      <w:r>
+        <w:rPr>
+          <w:i/>
+          <w:iCs/>
+        </w:rPr>
+        <w:t>Reinhardtius</w:t>
+      </w:r>
+      <w:proofErr w:type="spellEnd"/>
+      <w:r>
+        <w:rPr>
+          <w:i/>
+          <w:iCs/>
+        </w:rPr>
+        <w:t xml:space="preserve"> </w:t>
+      </w:r>
+      <w:proofErr w:type="spellStart"/>
+      <w:r>
+        <w:rPr>
+          <w:i/>
+          <w:iCs/>
+        </w:rPr>
+        <w:t>hippoglossoides</w:t>
+      </w:r>
+      <w:proofErr w:type="spellEnd"/>
+      <w:r>
+        <w:rPr>
+          <w:i/>
+          <w:iCs/>
+        </w:rPr>
+        <w:t>)</w:t>
+      </w:r>
+      <w:r>
+        <w:t>, Atlantic Cod (</w:t>
+      </w:r>
+      <w:r>
+        <w:rPr>
+          <w:i/>
+          <w:iCs/>
+        </w:rPr>
+        <w:t xml:space="preserve">Gadus </w:t>
+      </w:r>
+      <w:proofErr w:type="spellStart"/>
+      <w:r>
+        <w:rPr>
+          <w:i/>
+          <w:iCs/>
+        </w:rPr>
+        <w:t>morhua</w:t>
+      </w:r>
+      <w:proofErr w:type="spellEnd"/>
+      <w:r>
+        <w:rPr>
+          <w:i/>
+          <w:iCs/>
+        </w:rPr>
+        <w:t>)</w:t>
+      </w:r>
+      <w:r>
+        <w:t>, and Redfish (</w:t>
+      </w:r>
+      <w:r>
+        <w:rPr>
+          <w:i/>
+          <w:iCs/>
+        </w:rPr>
+        <w:t>Sebastes</w:t>
+      </w:r>
+      <w:r>
+        <w:t xml:space="preserve"> spp.).</w:t>
+      </w:r>
+    </w:p>
+    <w:p/>
     <w:p/>
     <w:p>
       <w:r>

</xml_diff>